<commit_message>
CV: add Projects section to Systems/Rust CV and its Canonical, Cloudflare, Igalia copies
</commit_message>
<xml_diff>
--- a/Career-Roadmap/CV/applications/canonical/Abdelrahman-Khalifa-CV.docx
+++ b/Career-Roadmap/CV/applications/canonical/Abdelrahman-Khalifa-CV.docx
@@ -806,7 +806,7 @@
           <w:i w:val="0"/>
           <w:sz w:val="20"/>
         </w:rPr>
-        <w:t xml:space="preserve">cups-rs: ported to libcups3 with CUPS 2 and CUPS 3 builds and CI; added IPP management operations, Printer Application support, connections by IP/port, </w:t>
+        <w:t xml:space="preserve">cups-rs: ported to libcups3 with CUPS 2 and CUPS 3 builds and CI; added IPP management operations, Printer Application support, IP/port connections, </w:t>
       </w:r>
       <w:r>
         <w:rPr>
@@ -824,7 +824,7 @@
           <w:i w:val="0"/>
           <w:sz w:val="20"/>
         </w:rPr>
-        <w:t xml:space="preserve"> support and FFI bindings for the libcups3 DNS-SD API (</w:t>
+        <w:t xml:space="preserve"> and FFI bindings for the libcups3 DNS-SD API (</w:t>
       </w:r>
       <w:hyperlink r:id="rId16">
         <w:r>
@@ -1196,6 +1196,106 @@
         <w:pStyle w:val="Heading1"/>
       </w:pPr>
       <w:r>
+        <w:t>PROJECTS</w:t>
+      </w:r>
+    </w:p>
+    <w:p>
+      <w:pPr>
+        <w:tabs>
+          <w:tab w:pos="259" w:val="left"/>
+        </w:tabs>
+        <w:spacing w:before="0" w:after="0" w:line="240" w:lineRule="auto"/>
+        <w:ind w:left="259" w:hanging="187"/>
+      </w:pPr>
+      <w:r>
+        <w:rPr>
+          <w:rFonts w:ascii="Calibri" w:hAnsi="Calibri"/>
+          <w:b w:val="0"/>
+          <w:i w:val="0"/>
+          <w:sz w:val="20"/>
+        </w:rPr>
+        <w:t>•</w:t>
+        <w:tab/>
+      </w:r>
+      <w:r>
+        <w:rPr>
+          <w:rFonts w:ascii="Calibri" w:hAnsi="Calibri"/>
+          <w:b/>
+          <w:i w:val="0"/>
+          <w:sz w:val="20"/>
+        </w:rPr>
+        <w:t>IoT Device Communication System</w:t>
+      </w:r>
+      <w:r>
+        <w:rPr>
+          <w:rFonts w:ascii="Calibri" w:hAnsi="Calibri"/>
+          <w:b w:val="0"/>
+          <w:i w:val="0"/>
+          <w:sz w:val="20"/>
+        </w:rPr>
+        <w:t xml:space="preserve"> (C++, Raspberry Pi 4, QEMU, Yocto): TCP unicast and UDP multicast framework between a Pi server and emulated clients. </w:t>
+      </w:r>
+      <w:hyperlink r:id="rId22">
+        <w:r>
+          <w:rPr>
+            <w:color w:val="1F5FA8"/>
+            <w:sz w:val="20"/>
+          </w:rPr>
+          <w:t xml:space="preserve">GitHub</w:t>
+        </w:r>
+      </w:hyperlink>
+    </w:p>
+    <w:p>
+      <w:pPr>
+        <w:tabs>
+          <w:tab w:pos="259" w:val="left"/>
+        </w:tabs>
+        <w:spacing w:before="0" w:after="0" w:line="240" w:lineRule="auto"/>
+        <w:ind w:left="259" w:hanging="187"/>
+      </w:pPr>
+      <w:r>
+        <w:rPr>
+          <w:rFonts w:ascii="Calibri" w:hAnsi="Calibri"/>
+          <w:b w:val="0"/>
+          <w:i w:val="0"/>
+          <w:sz w:val="20"/>
+        </w:rPr>
+        <w:t>•</w:t>
+        <w:tab/>
+      </w:r>
+      <w:r>
+        <w:rPr>
+          <w:rFonts w:ascii="Calibri" w:hAnsi="Calibri"/>
+          <w:b/>
+          <w:i w:val="0"/>
+          <w:sz w:val="20"/>
+        </w:rPr>
+        <w:t>Operating System Simulator</w:t>
+      </w:r>
+      <w:r>
+        <w:rPr>
+          <w:rFonts w:ascii="Calibri" w:hAnsi="Calibri"/>
+          <w:b w:val="0"/>
+          <w:i w:val="0"/>
+          <w:sz w:val="20"/>
+        </w:rPr>
+        <w:t xml:space="preserve"> (Java): CLI simulating scheduling, memory management, system calls and locks. </w:t>
+      </w:r>
+      <w:hyperlink r:id="rId23">
+        <w:r>
+          <w:rPr>
+            <w:color w:val="1F5FA8"/>
+            <w:sz w:val="20"/>
+          </w:rPr>
+          <w:t xml:space="preserve">GitHub</w:t>
+        </w:r>
+      </w:hyperlink>
+    </w:p>
+    <w:p>
+      <w:pPr>
+        <w:pStyle w:val="Heading1"/>
+      </w:pPr>
+      <w:r>
         <w:t>TECHNICAL SKILLS</w:t>
       </w:r>
     </w:p>
@@ -1296,70 +1396,6 @@
         <w:pStyle w:val="Heading1"/>
       </w:pPr>
       <w:r>
-        <w:t>ACHIEVEMENTS</w:t>
-      </w:r>
-    </w:p>
-    <w:p>
-      <w:pPr>
-        <w:tabs>
-          <w:tab w:pos="259" w:val="left"/>
-        </w:tabs>
-        <w:spacing w:before="0" w:after="0" w:line="240" w:lineRule="auto"/>
-        <w:ind w:left="259" w:hanging="187"/>
-      </w:pPr>
-      <w:r>
-        <w:rPr>
-          <w:rFonts w:ascii="Calibri" w:hAnsi="Calibri"/>
-          <w:b w:val="0"/>
-          <w:i w:val="0"/>
-          <w:sz w:val="20"/>
-        </w:rPr>
-        <w:t>•</w:t>
-        <w:tab/>
-      </w:r>
-      <w:r>
-        <w:rPr>
-          <w:rFonts w:ascii="Calibri" w:hAnsi="Calibri"/>
-          <w:b w:val="0"/>
-          <w:i w:val="0"/>
-          <w:sz w:val="20"/>
-        </w:rPr>
-        <w:t>Codeforces Expert (handle _Khalifa); 4-time ECPC finalist, 2021–2024 (Egyptian Collegiate Programming Contest).</w:t>
-      </w:r>
-    </w:p>
-    <w:p>
-      <w:pPr>
-        <w:tabs>
-          <w:tab w:pos="259" w:val="left"/>
-        </w:tabs>
-        <w:spacing w:before="0" w:after="0" w:line="240" w:lineRule="auto"/>
-        <w:ind w:left="259" w:hanging="187"/>
-      </w:pPr>
-      <w:r>
-        <w:rPr>
-          <w:rFonts w:ascii="Calibri" w:hAnsi="Calibri"/>
-          <w:b w:val="0"/>
-          <w:i w:val="0"/>
-          <w:sz w:val="20"/>
-        </w:rPr>
-        <w:t>•</w:t>
-        <w:tab/>
-      </w:r>
-      <w:r>
-        <w:rPr>
-          <w:rFonts w:ascii="Calibri" w:hAnsi="Calibri"/>
-          <w:b w:val="0"/>
-          <w:i w:val="0"/>
-          <w:sz w:val="20"/>
-        </w:rPr>
-        <w:t>Treasurer, IEEE Student Branch, Minia University: managed a budget of more than $10k.</w:t>
-      </w:r>
-    </w:p>
-    <w:p>
-      <w:pPr>
-        <w:pStyle w:val="Heading1"/>
-      </w:pPr>
-      <w:r>
         <w:t>EDUCATION</w:t>
       </w:r>
     </w:p>
@@ -1444,7 +1480,35 @@
           <w:i w:val="0"/>
           <w:sz w:val="20"/>
         </w:rPr>
-        <w:t>Grade: Very Good with Honors. Graduation project: AUTOSAR-based V2X vehicle on STM32; implemented the firmware update path and a dual-bank bootloader with rollback.</w:t>
+        <w:t>Grade: Very Good with Honors. Graduation project: AUTOSAR V2X vehicle on STM32 with a dual-bank bootloader.</w:t>
+      </w:r>
+    </w:p>
+    <w:p>
+      <w:pPr>
+        <w:tabs>
+          <w:tab w:pos="259" w:val="left"/>
+        </w:tabs>
+        <w:spacing w:before="0" w:after="0" w:line="240" w:lineRule="auto"/>
+        <w:ind w:left="259" w:hanging="187"/>
+      </w:pPr>
+      <w:r>
+        <w:rPr>
+          <w:rFonts w:ascii="Calibri" w:hAnsi="Calibri"/>
+          <w:b w:val="0"/>
+          <w:i w:val="0"/>
+          <w:sz w:val="20"/>
+        </w:rPr>
+        <w:t>•</w:t>
+        <w:tab/>
+      </w:r>
+      <w:r>
+        <w:rPr>
+          <w:rFonts w:ascii="Calibri" w:hAnsi="Calibri"/>
+          <w:b w:val="0"/>
+          <w:i w:val="0"/>
+          <w:sz w:val="20"/>
+        </w:rPr>
+        <w:t>Activities: Codeforces Expert; 4-time ECPC finalist (2021–2024); Treasurer, IEEE Student Branch.</w:t>
       </w:r>
     </w:p>
     <w:sectPr>

</xml_diff>

<commit_message>
CV: add Kernel Monitor project (Linux kernel module) to Systems, Embedded, Master CVs and the Canonical, Cloudflare, Igalia, NXP copies
</commit_message>
<xml_diff>
--- a/Career-Roadmap/CV/applications/canonical/Abdelrahman-Khalifa-CV.docx
+++ b/Career-Roadmap/CV/applications/canonical/Abdelrahman-Khalifa-CV.docx
@@ -1224,7 +1224,7 @@
           <w:i w:val="0"/>
           <w:sz w:val="20"/>
         </w:rPr>
-        <w:t>IoT Device Communication System</w:t>
+        <w:t>Kernel Monitor</w:t>
       </w:r>
       <w:r>
         <w:rPr>
@@ -1233,7 +1233,7 @@
           <w:i w:val="0"/>
           <w:sz w:val="20"/>
         </w:rPr>
-        <w:t xml:space="preserve"> (C++, Raspberry Pi 4, QEMU, Yocto): TCP unicast and UDP multicast framework between a Pi server and emulated clients. </w:t>
+        <w:t xml:space="preserve"> (C, Linux, ARM, QEMU): character device driver that walks the process list under RCU and exports per-task IDs, memory, threads, context switches and CPU time to user space; run on QEMU. </w:t>
       </w:r>
       <w:hyperlink r:id="rId22">
         <w:r>
@@ -1270,7 +1270,7 @@
           <w:i w:val="0"/>
           <w:sz w:val="20"/>
         </w:rPr>
-        <w:t>Operating System Simulator</w:t>
+        <w:t>IoT Device Communication System</w:t>
       </w:r>
       <w:r>
         <w:rPr>
@@ -1279,7 +1279,7 @@
           <w:i w:val="0"/>
           <w:sz w:val="20"/>
         </w:rPr>
-        <w:t xml:space="preserve"> (Java): CLI simulating scheduling, memory management, system calls and locks. </w:t>
+        <w:t xml:space="preserve"> (C++, Yocto): TCP and UDP multicast between a Pi and QEMU clients. </w:t>
       </w:r>
       <w:hyperlink r:id="rId23">
         <w:r>

</xml_diff>